<commit_message>
docs: add OAuth GCP warning to QA readiness report
Flag Google OAuth as requiring manual GCP configuration:
consent screen setup, credentials creation, redirect URI,
and Railway env vars before the login flow can be tested.

Co-Authored-By: Claude Sonnet 4.6 <noreply@anthropic.com>
Claude-Session: https://claude.ai/code/session_01MVBrhBqmAZoqLwZLJPKasv
</commit_message>
<xml_diff>
--- a/docs/qa-readiness-report.docx
+++ b/docs/qa-readiness-report.docx
@@ -197,46 +197,47 @@
               <w:jc w:val="center"/>
             </w:pPr>
             <w:r>
-              <w:t xml:space="preserve">✅</w:t>
-            </w:r>
-          </w:p>
-        </w:tc>
-        <w:tc>
-          <w:tcPr/>
-          <w:p>
-            <w:pPr>
-              <w:pStyle w:val="Compact"/>
-              <w:jc w:val="left"/>
-            </w:pPr>
-            <w:r>
-              <w:t xml:space="preserve">Use a</w:t>
+              <w:t xml:space="preserve">⚠️</w:t>
+            </w:r>
+          </w:p>
+        </w:tc>
+        <w:tc>
+          <w:tcPr/>
+          <w:p>
+            <w:pPr>
+              <w:pStyle w:val="Compact"/>
+              <w:jc w:val="left"/>
+            </w:pPr>
+            <w:r>
+              <w:rPr>
+                <w:bCs/>
+                <w:b/>
+              </w:rPr>
+              <w:t xml:space="preserve">Requires GCP setup before it can be tested</w:t>
             </w:r>
             <w:r>
               <w:t xml:space="preserve"> </w:t>
             </w:r>
             <w:r>
-              <w:rPr>
-                <w:rStyle w:val="VerbatimChar"/>
-              </w:rPr>
-              <w:t xml:space="preserve">@dblue.it</w:t>
+              <w:t xml:space="preserve">— OAuth consent screen and credentials must be configured on Google Cloud Platform first (see</w:t>
             </w:r>
             <w:r>
               <w:t xml:space="preserve"> </w:t>
             </w:r>
             <w:r>
-              <w:t xml:space="preserve">Google account; non-</w:t>
-            </w:r>
-            <w:r>
-              <w:rPr>
-                <w:rStyle w:val="VerbatimChar"/>
-              </w:rPr>
-              <w:t xml:space="preserve">@dblue.it</w:t>
+              <w:t xml:space="preserve">“</w:t>
+            </w:r>
+            <w:r>
+              <w:t xml:space="preserve">Out of Scope</w:t>
+            </w:r>
+            <w:r>
+              <w:t xml:space="preserve">”</w:t>
             </w:r>
             <w:r>
               <w:t xml:space="preserve"> </w:t>
             </w:r>
             <w:r>
-              <w:t xml:space="preserve">accounts should be rejected</w:t>
+              <w:t xml:space="preserve">section). Use dev login in the meantime.</w:t>
             </w:r>
           </w:p>
         </w:tc>
@@ -3703,19 +3704,112 @@
               <w:jc w:val="left"/>
             </w:pPr>
             <w:r>
-              <w:t xml:space="preserve">Google OAuth in production</w:t>
-            </w:r>
-          </w:p>
-        </w:tc>
-        <w:tc>
-          <w:tcPr/>
-          <w:p>
-            <w:pPr>
-              <w:pStyle w:val="Compact"/>
-              <w:jc w:val="left"/>
-            </w:pPr>
-            <w:r>
-              <w:t xml:space="preserve">OAuth credentials not yet configured on Google Cloud Console; dev login is the only auth method in staging</w:t>
+              <w:t xml:space="preserve">⚠️</w:t>
+            </w:r>
+            <w:r>
+              <w:t xml:space="preserve"> </w:t>
+            </w:r>
+            <w:r>
+              <w:rPr>
+                <w:bCs/>
+                <w:b/>
+              </w:rPr>
+              <w:t xml:space="preserve">Google OAuth — action required</w:t>
+            </w:r>
+          </w:p>
+        </w:tc>
+        <w:tc>
+          <w:tcPr/>
+          <w:p>
+            <w:pPr>
+              <w:pStyle w:val="Compact"/>
+              <w:jc w:val="left"/>
+            </w:pPr>
+            <w:r>
+              <w:t xml:space="preserve">OAuth credentials have not yet been configured on Google Cloud Platform. Before Google login can work in any environment, the following steps must be completed manually: (1) create a project on GCP, (2) enable the Google OAuth 2.0 API, (3) configure the</w:t>
+            </w:r>
+            <w:r>
+              <w:t xml:space="preserve"> </w:t>
+            </w:r>
+            <w:r>
+              <w:rPr>
+                <w:bCs/>
+                <w:b/>
+              </w:rPr>
+              <w:t xml:space="preserve">OAuth consent screen</w:t>
+            </w:r>
+            <w:r>
+              <w:t xml:space="preserve"> </w:t>
+            </w:r>
+            <w:r>
+              <w:t xml:space="preserve">(app name, support email, authorised domain</w:t>
+            </w:r>
+            <w:r>
+              <w:t xml:space="preserve"> </w:t>
+            </w:r>
+            <w:r>
+              <w:rPr>
+                <w:rStyle w:val="VerbatimChar"/>
+              </w:rPr>
+              <w:t xml:space="preserve">dblue.it</w:t>
+            </w:r>
+            <w:r>
+              <w:t xml:space="preserve">), (4) create OAuth 2.0 credentials (Web application type), (5) add the Railway backend callback URL as an authorised redirect URI (</w:t>
+            </w:r>
+            <w:r>
+              <w:rPr>
+                <w:rStyle w:val="VerbatimChar"/>
+              </w:rPr>
+              <w:t xml:space="preserve">https://&lt;backend-url&gt;/auth/google/callback</w:t>
+            </w:r>
+            <w:r>
+              <w:t xml:space="preserve">), (6) copy</w:t>
+            </w:r>
+            <w:r>
+              <w:t xml:space="preserve"> </w:t>
+            </w:r>
+            <w:r>
+              <w:rPr>
+                <w:rStyle w:val="VerbatimChar"/>
+              </w:rPr>
+              <w:t xml:space="preserve">GOOGLE_CLIENT_ID</w:t>
+            </w:r>
+            <w:r>
+              <w:t xml:space="preserve"> </w:t>
+            </w:r>
+            <w:r>
+              <w:t xml:space="preserve">and</w:t>
+            </w:r>
+            <w:r>
+              <w:t xml:space="preserve"> </w:t>
+            </w:r>
+            <w:r>
+              <w:rPr>
+                <w:rStyle w:val="VerbatimChar"/>
+              </w:rPr>
+              <w:t xml:space="preserve">GOOGLE_CLIENT_SECRET</w:t>
+            </w:r>
+            <w:r>
+              <w:t xml:space="preserve"> </w:t>
+            </w:r>
+            <w:r>
+              <w:t xml:space="preserve">into the Railway backend environment variables. Until this is done,</w:t>
+            </w:r>
+            <w:r>
+              <w:t xml:space="preserve"> </w:t>
+            </w:r>
+            <w:r>
+              <w:rPr>
+                <w:bCs/>
+                <w:b/>
+              </w:rPr>
+              <w:t xml:space="preserve">dev login is the only available auth method</w:t>
+            </w:r>
+            <w:r>
+              <w:t xml:space="preserve"> </w:t>
+            </w:r>
+            <w:r>
+              <w:t xml:space="preserve">in staging.</w:t>
             </w:r>
           </w:p>
         </w:tc>

</xml_diff>

<commit_message>
docs: mark all email-dependent features as untestable (SMTP not configured)
Waiting list promotion email, sick leave confirmation email,
and notification preference emails all get ⚠️ in the module
table. SMTP entry in Out of Scope expanded with required env vars.

Co-Authored-By: Claude Sonnet 4.6 <noreply@anthropic.com>
Claude-Session: https://claude.ai/code/session_01MVBrhBqmAZoqLwZLJPKasv
</commit_message>
<xml_diff>
--- a/docs/qa-readiness-report.docx
+++ b/docs/qa-readiness-report.docx
@@ -956,32 +956,22 @@
               <w:jc w:val="left"/>
             </w:pPr>
             <w:r>
-              <w:t xml:space="preserve">Off-time (morning / afternoon / custom hours)</w:t>
-            </w:r>
-          </w:p>
-        </w:tc>
-        <w:tc>
-          <w:tcPr/>
-          <w:p>
-            <w:pPr>
-              <w:pStyle w:val="Compact"/>
-              <w:jc w:val="center"/>
-            </w:pPr>
-            <w:r>
-              <w:t xml:space="preserve">✅</w:t>
-            </w:r>
-          </w:p>
-        </w:tc>
-        <w:tc>
-          <w:tcPr/>
-          <w:p>
-            <w:pPr>
-              <w:pStyle w:val="Compact"/>
-            </w:pPr>
-          </w:p>
-        </w:tc>
-      </w:tr>
-      <w:tr>
+              <w:t xml:space="preserve">Sick leave confirmation email</w:t>
+            </w:r>
+          </w:p>
+        </w:tc>
+        <w:tc>
+          <w:tcPr/>
+          <w:p>
+            <w:pPr>
+              <w:pStyle w:val="Compact"/>
+              <w:jc w:val="center"/>
+            </w:pPr>
+            <w:r>
+              <w:t xml:space="preserve">⚠️</w:t>
+            </w:r>
+          </w:p>
+        </w:tc>
         <w:tc>
           <w:tcPr/>
           <w:p>
@@ -994,40 +984,14 @@
                 <w:bCs/>
                 <w:b/>
               </w:rPr>
-              <w:t xml:space="preserve">Working Status</w:t>
-            </w:r>
-          </w:p>
-        </w:tc>
-        <w:tc>
-          <w:tcPr/>
-          <w:p>
-            <w:pPr>
-              <w:pStyle w:val="Compact"/>
-              <w:jc w:val="left"/>
-            </w:pPr>
-            <w:r>
-              <w:t xml:space="preserve">Block modification of a confirmed day</w:t>
-            </w:r>
-          </w:p>
-        </w:tc>
-        <w:tc>
-          <w:tcPr/>
-          <w:p>
-            <w:pPr>
-              <w:pStyle w:val="Compact"/>
-              <w:jc w:val="center"/>
-            </w:pPr>
-            <w:r>
-              <w:t xml:space="preserve">✅</w:t>
-            </w:r>
-          </w:p>
-        </w:tc>
-        <w:tc>
-          <w:tcPr/>
-          <w:p>
-            <w:pPr>
-              <w:pStyle w:val="Compact"/>
-            </w:pPr>
+              <w:t xml:space="preserve">Cannot be tested</w:t>
+            </w:r>
+            <w:r>
+              <w:t xml:space="preserve"> </w:t>
+            </w:r>
+            <w:r>
+              <w:t xml:space="preserve">— SMTP not configured on Railway. The sick status itself can be tested; email delivery cannot.</w:t>
+            </w:r>
           </w:p>
         </w:tc>
       </w:tr>
@@ -1056,7 +1020,7 @@
               <w:jc w:val="left"/>
             </w:pPr>
             <w:r>
-              <w:t xml:space="preserve">Retrofit (correct previous month’s status)</w:t>
+              <w:t xml:space="preserve">Off-time (morning / afternoon / custom hours)</w:t>
             </w:r>
           </w:p>
         </w:tc>
@@ -1077,11 +1041,7 @@
           <w:p>
             <w:pPr>
               <w:pStyle w:val="Compact"/>
-              <w:jc w:val="left"/>
-            </w:pPr>
-            <w:r>
-              <w:t xml:space="preserve">Own retrofit: any role; admin retrofit for other users: director/owner only</w:t>
-            </w:r>
+            </w:pPr>
           </w:p>
         </w:tc>
       </w:tr>
@@ -1098,19 +1058,19 @@
                 <w:bCs/>
                 <w:b/>
               </w:rPr>
-              <w:t xml:space="preserve">Desk Booking</w:t>
-            </w:r>
-          </w:p>
-        </w:tc>
-        <w:tc>
-          <w:tcPr/>
-          <w:p>
-            <w:pPr>
-              <w:pStyle w:val="Compact"/>
-              <w:jc w:val="left"/>
-            </w:pPr>
-            <w:r>
-              <w:t xml:space="preserve">Auto-downgrade to waiting list when office is full</w:t>
+              <w:t xml:space="preserve">Working Status</w:t>
+            </w:r>
+          </w:p>
+        </w:tc>
+        <w:tc>
+          <w:tcPr/>
+          <w:p>
+            <w:pPr>
+              <w:pStyle w:val="Compact"/>
+              <w:jc w:val="left"/>
+            </w:pPr>
+            <w:r>
+              <w:t xml:space="preserve">Block modification of a confirmed day</w:t>
             </w:r>
           </w:p>
         </w:tc>
@@ -1131,35 +1091,7 @@
           <w:p>
             <w:pPr>
               <w:pStyle w:val="Compact"/>
-              <w:jc w:val="left"/>
-            </w:pPr>
-            <w:r>
-              <w:t xml:space="preserve">Booking</w:t>
-            </w:r>
-            <w:r>
-              <w:t xml:space="preserve"> </w:t>
-            </w:r>
-            <w:r>
-              <w:rPr>
-                <w:rStyle w:val="VerbatimChar"/>
-              </w:rPr>
-              <w:t xml:space="preserve">in_office</w:t>
-            </w:r>
-            <w:r>
-              <w:t xml:space="preserve"> </w:t>
-            </w:r>
-            <w:r>
-              <w:t xml:space="preserve">when capacity is reached should return</w:t>
-            </w:r>
-            <w:r>
-              <w:t xml:space="preserve"> </w:t>
-            </w:r>
-            <w:r>
-              <w:rPr>
-                <w:rStyle w:val="VerbatimChar"/>
-              </w:rPr>
-              <w:t xml:space="preserve">waiting_list</w:t>
-            </w:r>
+            </w:pPr>
           </w:p>
         </w:tc>
       </w:tr>
@@ -1176,19 +1108,19 @@
                 <w:bCs/>
                 <w:b/>
               </w:rPr>
-              <w:t xml:space="preserve">Desk Booking</w:t>
-            </w:r>
-          </w:p>
-        </w:tc>
-        <w:tc>
-          <w:tcPr/>
-          <w:p>
-            <w:pPr>
-              <w:pStyle w:val="Compact"/>
-              <w:jc w:val="left"/>
-            </w:pPr>
-            <w:r>
-              <w:t xml:space="preserve">FIFO waiting list promotion when a desk frees up</w:t>
+              <w:t xml:space="preserve">Working Status</w:t>
+            </w:r>
+          </w:p>
+        </w:tc>
+        <w:tc>
+          <w:tcPr/>
+          <w:p>
+            <w:pPr>
+              <w:pStyle w:val="Compact"/>
+              <w:jc w:val="left"/>
+            </w:pPr>
+            <w:r>
+              <w:t xml:space="preserve">Retrofit (correct previous month’s status)</w:t>
             </w:r>
           </w:p>
         </w:tc>
@@ -1212,7 +1144,7 @@
               <w:jc w:val="left"/>
             </w:pPr>
             <w:r>
-              <w:t xml:space="preserve">Cancel an in-office booking → first person in waiting list gets promoted</w:t>
+              <w:t xml:space="preserve">Own retrofit: any role; admin retrofit for other users: director/owner only</w:t>
             </w:r>
           </w:p>
         </w:tc>
@@ -1242,7 +1174,7 @@
               <w:jc w:val="left"/>
             </w:pPr>
             <w:r>
-              <w:t xml:space="preserve">Waiting list promotion email</w:t>
+              <w:t xml:space="preserve">Auto-downgrade to waiting list when office is full</w:t>
             </w:r>
           </w:p>
         </w:tc>
@@ -1266,7 +1198,31 @@
               <w:jc w:val="left"/>
             </w:pPr>
             <w:r>
-              <w:t xml:space="preserve">Only if SMTP is configured; otherwise logged to console</w:t>
+              <w:t xml:space="preserve">Booking</w:t>
+            </w:r>
+            <w:r>
+              <w:t xml:space="preserve"> </w:t>
+            </w:r>
+            <w:r>
+              <w:rPr>
+                <w:rStyle w:val="VerbatimChar"/>
+              </w:rPr>
+              <w:t xml:space="preserve">in_office</w:t>
+            </w:r>
+            <w:r>
+              <w:t xml:space="preserve"> </w:t>
+            </w:r>
+            <w:r>
+              <w:t xml:space="preserve">when capacity is reached should return</w:t>
+            </w:r>
+            <w:r>
+              <w:t xml:space="preserve"> </w:t>
+            </w:r>
+            <w:r>
+              <w:rPr>
+                <w:rStyle w:val="VerbatimChar"/>
+              </w:rPr>
+              <w:t xml:space="preserve">waiting_list</w:t>
             </w:r>
           </w:p>
         </w:tc>
@@ -1284,31 +1240,19 @@
                 <w:bCs/>
                 <w:b/>
               </w:rPr>
-              <w:t xml:space="preserve">Check-in</w:t>
-            </w:r>
-          </w:p>
-        </w:tc>
-        <w:tc>
-          <w:tcPr/>
-          <w:p>
-            <w:pPr>
-              <w:pStyle w:val="Compact"/>
-              <w:jc w:val="left"/>
-            </w:pPr>
-            <w:r>
-              <w:t xml:space="preserve">“</w:t>
-            </w:r>
-            <w:r>
-              <w:t xml:space="preserve">Say Good Morning</w:t>
-            </w:r>
-            <w:r>
-              <w:t xml:space="preserve">”</w:t>
-            </w:r>
-            <w:r>
-              <w:t xml:space="preserve"> </w:t>
-            </w:r>
-            <w:r>
-              <w:t xml:space="preserve">— confirm today’s presence</w:t>
+              <w:t xml:space="preserve">Desk Booking</w:t>
+            </w:r>
+          </w:p>
+        </w:tc>
+        <w:tc>
+          <w:tcPr/>
+          <w:p>
+            <w:pPr>
+              <w:pStyle w:val="Compact"/>
+              <w:jc w:val="left"/>
+            </w:pPr>
+            <w:r>
+              <w:t xml:space="preserve">FIFO waiting list promotion when a desk frees up</w:t>
             </w:r>
           </w:p>
         </w:tc>
@@ -1332,7 +1276,7 @@
               <w:jc w:val="left"/>
             </w:pPr>
             <w:r>
-              <w:t xml:space="preserve">Only available for the current day</w:t>
+              <w:t xml:space="preserve">Cancel an in-office booking → first person in waiting list gets promoted</w:t>
             </w:r>
           </w:p>
         </w:tc>
@@ -1350,44 +1294,34 @@
                 <w:bCs/>
                 <w:b/>
               </w:rPr>
-              <w:t xml:space="preserve">Check-in</w:t>
-            </w:r>
-          </w:p>
-        </w:tc>
-        <w:tc>
-          <w:tcPr/>
-          <w:p>
-            <w:pPr>
-              <w:pStyle w:val="Compact"/>
-              <w:jc w:val="left"/>
-            </w:pPr>
-            <w:r>
-              <w:t xml:space="preserve">Room + desk selection at check-in</w:t>
-            </w:r>
-          </w:p>
-        </w:tc>
-        <w:tc>
-          <w:tcPr/>
-          <w:p>
-            <w:pPr>
-              <w:pStyle w:val="Compact"/>
-              <w:jc w:val="center"/>
-            </w:pPr>
-            <w:r>
-              <w:t xml:space="preserve">✅</w:t>
-            </w:r>
-          </w:p>
-        </w:tc>
-        <w:tc>
-          <w:tcPr/>
-          <w:p>
-            <w:pPr>
-              <w:pStyle w:val="Compact"/>
-            </w:pPr>
-          </w:p>
-        </w:tc>
-      </w:tr>
-      <w:tr>
+              <w:t xml:space="preserve">Desk Booking</w:t>
+            </w:r>
+          </w:p>
+        </w:tc>
+        <w:tc>
+          <w:tcPr/>
+          <w:p>
+            <w:pPr>
+              <w:pStyle w:val="Compact"/>
+              <w:jc w:val="left"/>
+            </w:pPr>
+            <w:r>
+              <w:t xml:space="preserve">Waiting list promotion email</w:t>
+            </w:r>
+          </w:p>
+        </w:tc>
+        <w:tc>
+          <w:tcPr/>
+          <w:p>
+            <w:pPr>
+              <w:pStyle w:val="Compact"/>
+              <w:jc w:val="center"/>
+            </w:pPr>
+            <w:r>
+              <w:t xml:space="preserve">⚠️</w:t>
+            </w:r>
+          </w:p>
+        </w:tc>
         <w:tc>
           <w:tcPr/>
           <w:p>
@@ -1400,40 +1334,14 @@
                 <w:bCs/>
                 <w:b/>
               </w:rPr>
-              <w:t xml:space="preserve">Check-in</w:t>
-            </w:r>
-          </w:p>
-        </w:tc>
-        <w:tc>
-          <w:tcPr/>
-          <w:p>
-            <w:pPr>
-              <w:pStyle w:val="Compact"/>
-              <w:jc w:val="left"/>
-            </w:pPr>
-            <w:r>
-              <w:t xml:space="preserve">Block check-in if on waiting list</w:t>
-            </w:r>
-          </w:p>
-        </w:tc>
-        <w:tc>
-          <w:tcPr/>
-          <w:p>
-            <w:pPr>
-              <w:pStyle w:val="Compact"/>
-              <w:jc w:val="center"/>
-            </w:pPr>
-            <w:r>
-              <w:t xml:space="preserve">✅</w:t>
-            </w:r>
-          </w:p>
-        </w:tc>
-        <w:tc>
-          <w:tcPr/>
-          <w:p>
-            <w:pPr>
-              <w:pStyle w:val="Compact"/>
-            </w:pPr>
+              <w:t xml:space="preserve">Cannot be tested</w:t>
+            </w:r>
+            <w:r>
+              <w:t xml:space="preserve"> </w:t>
+            </w:r>
+            <w:r>
+              <w:t xml:space="preserve">— SMTP not configured on Railway. The promotion logic itself (status change) can be verified, but the email delivery cannot.</w:t>
+            </w:r>
           </w:p>
         </w:tc>
       </w:tr>
@@ -1462,7 +1370,19 @@
               <w:jc w:val="left"/>
             </w:pPr>
             <w:r>
-              <w:t xml:space="preserve">Remote check-in (no room required)</w:t>
+              <w:t xml:space="preserve">“</w:t>
+            </w:r>
+            <w:r>
+              <w:t xml:space="preserve">Say Good Morning</w:t>
+            </w:r>
+            <w:r>
+              <w:t xml:space="preserve">”</w:t>
+            </w:r>
+            <w:r>
+              <w:t xml:space="preserve"> </w:t>
+            </w:r>
+            <w:r>
+              <w:t xml:space="preserve">— confirm today’s presence</w:t>
             </w:r>
           </w:p>
         </w:tc>
@@ -1483,7 +1403,11 @@
           <w:p>
             <w:pPr>
               <w:pStyle w:val="Compact"/>
-            </w:pPr>
+              <w:jc w:val="left"/>
+            </w:pPr>
+            <w:r>
+              <w:t xml:space="preserve">Only available for the current day</w:t>
+            </w:r>
           </w:p>
         </w:tc>
       </w:tr>
@@ -1500,19 +1424,19 @@
                 <w:bCs/>
                 <w:b/>
               </w:rPr>
-              <w:t xml:space="preserve">Stats — Personal</w:t>
-            </w:r>
-          </w:p>
-        </w:tc>
-        <w:tc>
-          <w:tcPr/>
-          <w:p>
-            <w:pPr>
-              <w:pStyle w:val="Compact"/>
-              <w:jc w:val="left"/>
-            </w:pPr>
-            <w:r>
-              <w:t xml:space="preserve">Monthly confirmed days vs. target</w:t>
+              <w:t xml:space="preserve">Check-in</w:t>
+            </w:r>
+          </w:p>
+        </w:tc>
+        <w:tc>
+          <w:tcPr/>
+          <w:p>
+            <w:pPr>
+              <w:pStyle w:val="Compact"/>
+              <w:jc w:val="left"/>
+            </w:pPr>
+            <w:r>
+              <w:t xml:space="preserve">Room + desk selection at check-in</w:t>
             </w:r>
           </w:p>
         </w:tc>
@@ -1550,19 +1474,19 @@
                 <w:bCs/>
                 <w:b/>
               </w:rPr>
-              <w:t xml:space="preserve">Stats — Personal</w:t>
-            </w:r>
-          </w:p>
-        </w:tc>
-        <w:tc>
-          <w:tcPr/>
-          <w:p>
-            <w:pPr>
-              <w:pStyle w:val="Compact"/>
-              <w:jc w:val="left"/>
-            </w:pPr>
-            <w:r>
-              <w:t xml:space="preserve">Status distribution (in office / remote / mission / leave / sick)</w:t>
+              <w:t xml:space="preserve">Check-in</w:t>
+            </w:r>
+          </w:p>
+        </w:tc>
+        <w:tc>
+          <w:tcPr/>
+          <w:p>
+            <w:pPr>
+              <w:pStyle w:val="Compact"/>
+              <w:jc w:val="left"/>
+            </w:pPr>
+            <w:r>
+              <w:t xml:space="preserve">Block check-in if on waiting list</w:t>
             </w:r>
           </w:p>
         </w:tc>
@@ -1600,19 +1524,19 @@
                 <w:bCs/>
                 <w:b/>
               </w:rPr>
-              <w:t xml:space="preserve">Stats — Personal</w:t>
-            </w:r>
-          </w:p>
-        </w:tc>
-        <w:tc>
-          <w:tcPr/>
-          <w:p>
-            <w:pPr>
-              <w:pStyle w:val="Compact"/>
-              <w:jc w:val="left"/>
-            </w:pPr>
-            <w:r>
-              <w:t xml:space="preserve">Annual breakdown (month-by-month bar chart)</w:t>
+              <w:t xml:space="preserve">Check-in</w:t>
+            </w:r>
+          </w:p>
+        </w:tc>
+        <w:tc>
+          <w:tcPr/>
+          <w:p>
+            <w:pPr>
+              <w:pStyle w:val="Compact"/>
+              <w:jc w:val="left"/>
+            </w:pPr>
+            <w:r>
+              <w:t xml:space="preserve">Remote check-in (no room required)</w:t>
             </w:r>
           </w:p>
         </w:tc>
@@ -1633,11 +1557,7 @@
           <w:p>
             <w:pPr>
               <w:pStyle w:val="Compact"/>
-              <w:jc w:val="left"/>
-            </w:pPr>
-            <w:r>
-              <w:t xml:space="preserve">Only shows completed months</w:t>
-            </w:r>
+            </w:pPr>
           </w:p>
         </w:tc>
       </w:tr>
@@ -1666,7 +1586,7 @@
               <w:jc w:val="left"/>
             </w:pPr>
             <w:r>
-              <w:t xml:space="preserve">Last-minute unbooking count</w:t>
+              <w:t xml:space="preserve">Monthly confirmed days vs. target</w:t>
             </w:r>
           </w:p>
         </w:tc>
@@ -1704,19 +1624,19 @@
                 <w:bCs/>
                 <w:b/>
               </w:rPr>
-              <w:t xml:space="preserve">Stats — Org</w:t>
-            </w:r>
-          </w:p>
-        </w:tc>
-        <w:tc>
-          <w:tcPr/>
-          <w:p>
-            <w:pPr>
-              <w:pStyle w:val="Compact"/>
-              <w:jc w:val="left"/>
-            </w:pPr>
-            <w:r>
-              <w:t xml:space="preserve">Organisation-wide stats (director/owner only)</w:t>
+              <w:t xml:space="preserve">Stats — Personal</w:t>
+            </w:r>
+          </w:p>
+        </w:tc>
+        <w:tc>
+          <w:tcPr/>
+          <w:p>
+            <w:pPr>
+              <w:pStyle w:val="Compact"/>
+              <w:jc w:val="left"/>
+            </w:pPr>
+            <w:r>
+              <w:t xml:space="preserve">Status distribution (in office / remote / mission / leave / sick)</w:t>
             </w:r>
           </w:p>
         </w:tc>
@@ -1737,11 +1657,7 @@
           <w:p>
             <w:pPr>
               <w:pStyle w:val="Compact"/>
-              <w:jc w:val="left"/>
-            </w:pPr>
-            <w:r>
-              <w:t xml:space="preserve">Average confirmed days, users above/below target</w:t>
-            </w:r>
+            </w:pPr>
           </w:p>
         </w:tc>
       </w:tr>
@@ -1758,19 +1674,19 @@
                 <w:bCs/>
                 <w:b/>
               </w:rPr>
-              <w:t xml:space="preserve">Stats — Org</w:t>
-            </w:r>
-          </w:p>
-        </w:tc>
-        <w:tc>
-          <w:tcPr/>
-          <w:p>
-            <w:pPr>
-              <w:pStyle w:val="Compact"/>
-              <w:jc w:val="left"/>
-            </w:pPr>
-            <w:r>
-              <w:t xml:space="preserve">Per-colleague drill-down (director/owner only)</w:t>
+              <w:t xml:space="preserve">Stats — Personal</w:t>
+            </w:r>
+          </w:p>
+        </w:tc>
+        <w:tc>
+          <w:tcPr/>
+          <w:p>
+            <w:pPr>
+              <w:pStyle w:val="Compact"/>
+              <w:jc w:val="left"/>
+            </w:pPr>
+            <w:r>
+              <w:t xml:space="preserve">Annual breakdown (month-by-month bar chart)</w:t>
             </w:r>
           </w:p>
         </w:tc>
@@ -1791,7 +1707,11 @@
           <w:p>
             <w:pPr>
               <w:pStyle w:val="Compact"/>
-            </w:pPr>
+              <w:jc w:val="left"/>
+            </w:pPr>
+            <w:r>
+              <w:t xml:space="preserve">Only shows completed months</w:t>
+            </w:r>
           </w:p>
         </w:tc>
       </w:tr>
@@ -1808,19 +1728,19 @@
                 <w:bCs/>
                 <w:b/>
               </w:rPr>
-              <w:t xml:space="preserve">Profile</w:t>
-            </w:r>
-          </w:p>
-        </w:tc>
-        <w:tc>
-          <w:tcPr/>
-          <w:p>
-            <w:pPr>
-              <w:pStyle w:val="Compact"/>
-              <w:jc w:val="left"/>
-            </w:pPr>
-            <w:r>
-              <w:t xml:space="preserve">Theme preference (light / dark / system)</w:t>
+              <w:t xml:space="preserve">Stats — Personal</w:t>
+            </w:r>
+          </w:p>
+        </w:tc>
+        <w:tc>
+          <w:tcPr/>
+          <w:p>
+            <w:pPr>
+              <w:pStyle w:val="Compact"/>
+              <w:jc w:val="left"/>
+            </w:pPr>
+            <w:r>
+              <w:t xml:space="preserve">Last-minute unbooking count</w:t>
             </w:r>
           </w:p>
         </w:tc>
@@ -1841,11 +1761,7 @@
           <w:p>
             <w:pPr>
               <w:pStyle w:val="Compact"/>
-              <w:jc w:val="left"/>
-            </w:pPr>
-            <w:r>
-              <w:t xml:space="preserve">Persisted to backend</w:t>
-            </w:r>
+            </w:pPr>
           </w:p>
         </w:tc>
       </w:tr>
@@ -1862,19 +1778,19 @@
                 <w:bCs/>
                 <w:b/>
               </w:rPr>
-              <w:t xml:space="preserve">Profile</w:t>
-            </w:r>
-          </w:p>
-        </w:tc>
-        <w:tc>
-          <w:tcPr/>
-          <w:p>
-            <w:pPr>
-              <w:pStyle w:val="Compact"/>
-              <w:jc w:val="left"/>
-            </w:pPr>
-            <w:r>
-              <w:t xml:space="preserve">Accessibility preferences (reduced motion, text size, screen reader, high contrast)</w:t>
+              <w:t xml:space="preserve">Stats — Org</w:t>
+            </w:r>
+          </w:p>
+        </w:tc>
+        <w:tc>
+          <w:tcPr/>
+          <w:p>
+            <w:pPr>
+              <w:pStyle w:val="Compact"/>
+              <w:jc w:val="left"/>
+            </w:pPr>
+            <w:r>
+              <w:t xml:space="preserve">Organisation-wide stats (director/owner only)</w:t>
             </w:r>
           </w:p>
         </w:tc>
@@ -1895,7 +1811,11 @@
           <w:p>
             <w:pPr>
               <w:pStyle w:val="Compact"/>
-            </w:pPr>
+              <w:jc w:val="left"/>
+            </w:pPr>
+            <w:r>
+              <w:t xml:space="preserve">Average confirmed days, users above/below target</w:t>
+            </w:r>
           </w:p>
         </w:tc>
       </w:tr>
@@ -1912,6 +1832,56 @@
                 <w:bCs/>
                 <w:b/>
               </w:rPr>
+              <w:t xml:space="preserve">Stats — Org</w:t>
+            </w:r>
+          </w:p>
+        </w:tc>
+        <w:tc>
+          <w:tcPr/>
+          <w:p>
+            <w:pPr>
+              <w:pStyle w:val="Compact"/>
+              <w:jc w:val="left"/>
+            </w:pPr>
+            <w:r>
+              <w:t xml:space="preserve">Per-colleague drill-down (director/owner only)</w:t>
+            </w:r>
+          </w:p>
+        </w:tc>
+        <w:tc>
+          <w:tcPr/>
+          <w:p>
+            <w:pPr>
+              <w:pStyle w:val="Compact"/>
+              <w:jc w:val="center"/>
+            </w:pPr>
+            <w:r>
+              <w:t xml:space="preserve">✅</w:t>
+            </w:r>
+          </w:p>
+        </w:tc>
+        <w:tc>
+          <w:tcPr/>
+          <w:p>
+            <w:pPr>
+              <w:pStyle w:val="Compact"/>
+            </w:pPr>
+          </w:p>
+        </w:tc>
+      </w:tr>
+      <w:tr>
+        <w:tc>
+          <w:tcPr/>
+          <w:p>
+            <w:pPr>
+              <w:pStyle w:val="Compact"/>
+              <w:jc w:val="left"/>
+            </w:pPr>
+            <w:r>
+              <w:rPr>
+                <w:bCs/>
+                <w:b/>
+              </w:rPr>
               <w:t xml:space="preserve">Profile</w:t>
             </w:r>
           </w:p>
@@ -1924,6 +1894,110 @@
               <w:jc w:val="left"/>
             </w:pPr>
             <w:r>
+              <w:t xml:space="preserve">Theme preference (light / dark / system)</w:t>
+            </w:r>
+          </w:p>
+        </w:tc>
+        <w:tc>
+          <w:tcPr/>
+          <w:p>
+            <w:pPr>
+              <w:pStyle w:val="Compact"/>
+              <w:jc w:val="center"/>
+            </w:pPr>
+            <w:r>
+              <w:t xml:space="preserve">✅</w:t>
+            </w:r>
+          </w:p>
+        </w:tc>
+        <w:tc>
+          <w:tcPr/>
+          <w:p>
+            <w:pPr>
+              <w:pStyle w:val="Compact"/>
+              <w:jc w:val="left"/>
+            </w:pPr>
+            <w:r>
+              <w:t xml:space="preserve">Persisted to backend</w:t>
+            </w:r>
+          </w:p>
+        </w:tc>
+      </w:tr>
+      <w:tr>
+        <w:tc>
+          <w:tcPr/>
+          <w:p>
+            <w:pPr>
+              <w:pStyle w:val="Compact"/>
+              <w:jc w:val="left"/>
+            </w:pPr>
+            <w:r>
+              <w:rPr>
+                <w:bCs/>
+                <w:b/>
+              </w:rPr>
+              <w:t xml:space="preserve">Profile</w:t>
+            </w:r>
+          </w:p>
+        </w:tc>
+        <w:tc>
+          <w:tcPr/>
+          <w:p>
+            <w:pPr>
+              <w:pStyle w:val="Compact"/>
+              <w:jc w:val="left"/>
+            </w:pPr>
+            <w:r>
+              <w:t xml:space="preserve">Accessibility preferences (reduced motion, text size, screen reader, high contrast)</w:t>
+            </w:r>
+          </w:p>
+        </w:tc>
+        <w:tc>
+          <w:tcPr/>
+          <w:p>
+            <w:pPr>
+              <w:pStyle w:val="Compact"/>
+              <w:jc w:val="center"/>
+            </w:pPr>
+            <w:r>
+              <w:t xml:space="preserve">✅</w:t>
+            </w:r>
+          </w:p>
+        </w:tc>
+        <w:tc>
+          <w:tcPr/>
+          <w:p>
+            <w:pPr>
+              <w:pStyle w:val="Compact"/>
+            </w:pPr>
+          </w:p>
+        </w:tc>
+      </w:tr>
+      <w:tr>
+        <w:tc>
+          <w:tcPr/>
+          <w:p>
+            <w:pPr>
+              <w:pStyle w:val="Compact"/>
+              <w:jc w:val="left"/>
+            </w:pPr>
+            <w:r>
+              <w:rPr>
+                <w:bCs/>
+                <w:b/>
+              </w:rPr>
+              <w:t xml:space="preserve">Profile</w:t>
+            </w:r>
+          </w:p>
+        </w:tc>
+        <w:tc>
+          <w:tcPr/>
+          <w:p>
+            <w:pPr>
+              <w:pStyle w:val="Compact"/>
+              <w:jc w:val="left"/>
+            </w:pPr>
+            <w:r>
               <w:t xml:space="preserve">Notification preferences toggles</w:t>
             </w:r>
           </w:p>
@@ -1936,19 +2010,80 @@
               <w:jc w:val="center"/>
             </w:pPr>
             <w:r>
-              <w:t xml:space="preserve">✅</w:t>
-            </w:r>
-          </w:p>
-        </w:tc>
-        <w:tc>
-          <w:tcPr/>
-          <w:p>
-            <w:pPr>
-              <w:pStyle w:val="Compact"/>
-              <w:jc w:val="left"/>
-            </w:pPr>
-            <w:r>
-              <w:t xml:space="preserve">Toggles persist; emails for 4 of 6 types are not yet sent (see known gaps)</w:t>
+              <w:t xml:space="preserve">⚠️</w:t>
+            </w:r>
+          </w:p>
+        </w:tc>
+        <w:tc>
+          <w:tcPr/>
+          <w:p>
+            <w:pPr>
+              <w:pStyle w:val="Compact"/>
+              <w:jc w:val="left"/>
+            </w:pPr>
+            <w:r>
+              <w:t xml:space="preserve">Toggle UI and persistence can be tested.</w:t>
+            </w:r>
+            <w:r>
+              <w:t xml:space="preserve"> </w:t>
+            </w:r>
+            <w:r>
+              <w:rPr>
+                <w:bCs/>
+                <w:b/>
+              </w:rPr>
+              <w:t xml:space="preserve">Email delivery cannot be tested</w:t>
+            </w:r>
+            <w:r>
+              <w:t xml:space="preserve"> </w:t>
+            </w:r>
+            <w:r>
+              <w:t xml:space="preserve">— SMTP not configured on Railway. Additionally, 4 of 6 notification types (</w:t>
+            </w:r>
+            <w:r>
+              <w:rPr>
+                <w:rStyle w:val="VerbatimChar"/>
+              </w:rPr>
+              <w:t xml:space="preserve">Status reminder 11:00</w:t>
+            </w:r>
+            <w:r>
+              <w:t xml:space="preserve">,</w:t>
+            </w:r>
+            <w:r>
+              <w:t xml:space="preserve"> </w:t>
+            </w:r>
+            <w:r>
+              <w:rPr>
+                <w:rStyle w:val="VerbatimChar"/>
+              </w:rPr>
+              <w:t xml:space="preserve">Status reminder 18:00</w:t>
+            </w:r>
+            <w:r>
+              <w:t xml:space="preserve">,</w:t>
+            </w:r>
+            <w:r>
+              <w:t xml:space="preserve"> </w:t>
+            </w:r>
+            <w:r>
+              <w:rPr>
+                <w:rStyle w:val="VerbatimChar"/>
+              </w:rPr>
+              <w:t xml:space="preserve">Project teammate booking</w:t>
+            </w:r>
+            <w:r>
+              <w:t xml:space="preserve">,</w:t>
+            </w:r>
+            <w:r>
+              <w:t xml:space="preserve"> </w:t>
+            </w:r>
+            <w:r>
+              <w:rPr>
+                <w:rStyle w:val="VerbatimChar"/>
+              </w:rPr>
+              <w:t xml:space="preserve">Monthly overview</w:t>
+            </w:r>
+            <w:r>
+              <w:t xml:space="preserve">) have no email implementation yet (see Known Gaps #4).</w:t>
             </w:r>
           </w:p>
         </w:tc>
@@ -3823,19 +3958,108 @@
               <w:jc w:val="left"/>
             </w:pPr>
             <w:r>
-              <w:t xml:space="preserve">SMTP email delivery</w:t>
-            </w:r>
-          </w:p>
-        </w:tc>
-        <w:tc>
-          <w:tcPr/>
-          <w:p>
-            <w:pPr>
-              <w:pStyle w:val="Compact"/>
-              <w:jc w:val="left"/>
-            </w:pPr>
-            <w:r>
-              <w:t xml:space="preserve">Not configured in staging; emails are printed to the backend console log instead</w:t>
+              <w:t xml:space="preserve">⚠️</w:t>
+            </w:r>
+            <w:r>
+              <w:t xml:space="preserve"> </w:t>
+            </w:r>
+            <w:r>
+              <w:rPr>
+                <w:bCs/>
+                <w:b/>
+              </w:rPr>
+              <w:t xml:space="preserve">SMTP email delivery — action required</w:t>
+            </w:r>
+          </w:p>
+        </w:tc>
+        <w:tc>
+          <w:tcPr/>
+          <w:p>
+            <w:pPr>
+              <w:pStyle w:val="Compact"/>
+              <w:jc w:val="left"/>
+            </w:pPr>
+            <w:r>
+              <w:t xml:space="preserve">SMTP credentials are not configured on Railway. All email notifications (waiting list promotion, sick leave confirmation) are silently logged to the backend console instead of being sent. To enable: set</w:t>
+            </w:r>
+            <w:r>
+              <w:t xml:space="preserve"> </w:t>
+            </w:r>
+            <w:r>
+              <w:rPr>
+                <w:rStyle w:val="VerbatimChar"/>
+              </w:rPr>
+              <w:t xml:space="preserve">SMTP_HOST</w:t>
+            </w:r>
+            <w:r>
+              <w:t xml:space="preserve">,</w:t>
+            </w:r>
+            <w:r>
+              <w:t xml:space="preserve"> </w:t>
+            </w:r>
+            <w:r>
+              <w:rPr>
+                <w:rStyle w:val="VerbatimChar"/>
+              </w:rPr>
+              <w:t xml:space="preserve">SMTP_PORT</w:t>
+            </w:r>
+            <w:r>
+              <w:t xml:space="preserve">,</w:t>
+            </w:r>
+            <w:r>
+              <w:t xml:space="preserve"> </w:t>
+            </w:r>
+            <w:r>
+              <w:rPr>
+                <w:rStyle w:val="VerbatimChar"/>
+              </w:rPr>
+              <w:t xml:space="preserve">SMTP_USER</w:t>
+            </w:r>
+            <w:r>
+              <w:t xml:space="preserve">,</w:t>
+            </w:r>
+            <w:r>
+              <w:t xml:space="preserve"> </w:t>
+            </w:r>
+            <w:r>
+              <w:rPr>
+                <w:rStyle w:val="VerbatimChar"/>
+              </w:rPr>
+              <w:t xml:space="preserve">SMTP_PASS</w:t>
+            </w:r>
+            <w:r>
+              <w:t xml:space="preserve">,</w:t>
+            </w:r>
+            <w:r>
+              <w:t xml:space="preserve"> </w:t>
+            </w:r>
+            <w:r>
+              <w:rPr>
+                <w:rStyle w:val="VerbatimChar"/>
+              </w:rPr>
+              <w:t xml:space="preserve">SMTP_FROM</w:t>
+            </w:r>
+            <w:r>
+              <w:t xml:space="preserve"> </w:t>
+            </w:r>
+            <w:r>
+              <w:t xml:space="preserve">in the Railway backend environment variables. Until then,</w:t>
+            </w:r>
+            <w:r>
+              <w:t xml:space="preserve"> </w:t>
+            </w:r>
+            <w:r>
+              <w:rPr>
+                <w:bCs/>
+                <w:b/>
+              </w:rPr>
+              <w:t xml:space="preserve">any feature involving email delivery cannot be fully tested</w:t>
+            </w:r>
+            <w:r>
+              <w:t xml:space="preserve"> </w:t>
+            </w:r>
+            <w:r>
+              <w:t xml:space="preserve">(marked ⚠️ in the table above).</w:t>
             </w:r>
           </w:p>
         </w:tc>

</xml_diff>